<commit_message>
Entrega Final - Prova
Conferencia de patrimônio
Login
Sessão de Conferência
Dashboard
Gráfico
Perfil
</commit_message>
<xml_diff>
--- a/Entraga AC 1.docx
+++ b/Entraga AC 1.docx
@@ -278,14 +278,7 @@
           <w:b/>
           <w:bCs/>
         </w:rPr>
-        <w:t>ENTREGA AC</w:t>
-      </w:r>
-      <w:r>
-        <w:rPr>
-          <w:b/>
-          <w:bCs/>
-        </w:rPr>
-        <w:t>3</w:t>
+        <w:t>ENTREGA AC3</w:t>
       </w:r>
     </w:p>
     <w:p>
@@ -355,10 +348,9 @@
     </w:p>
     <w:p>
       <w:pPr>
-        <w:rPr>
-          <w:b/>
-          <w:bCs/>
-        </w:rPr>
+        <w:tabs>
+          <w:tab w:val="center" w:pos="4252"/>
+        </w:tabs>
       </w:pPr>
       <w:hyperlink r:id="rId12" w:history="1">
         <w:r>
@@ -367,25 +359,142 @@
             <w:b/>
             <w:bCs/>
           </w:rPr>
-          <w:t>https://youtu.be/Y</w:t>
+          <w:t>https://youtu.be/Y_yBuUZ39Jg</w:t>
         </w:r>
+      </w:hyperlink>
+      <w:r>
+        <w:tab/>
+      </w:r>
+    </w:p>
+    <w:p>
+      <w:r>
+        <w:br w:type="page"/>
+      </w:r>
+    </w:p>
+    <w:p>
+      <w:pPr>
+        <w:pBdr>
+          <w:bottom w:val="single" w:sz="4" w:space="1" w:color="auto"/>
+        </w:pBdr>
+        <w:jc w:val="center"/>
+        <w:rPr>
+          <w:b/>
+          <w:bCs/>
+        </w:rPr>
+      </w:pPr>
+      <w:r>
+        <w:rPr>
+          <w:b/>
+          <w:bCs/>
+        </w:rPr>
+        <w:lastRenderedPageBreak/>
+        <w:t>ENTREGA</w:t>
+      </w:r>
+      <w:r>
+        <w:rPr>
+          <w:b/>
+          <w:bCs/>
+        </w:rPr>
+        <w:t xml:space="preserve"> FINAL</w:t>
+      </w:r>
+      <w:r>
+        <w:rPr>
+          <w:b/>
+          <w:bCs/>
+        </w:rPr>
+        <w:t xml:space="preserve"> PROVA</w:t>
+      </w:r>
+    </w:p>
+    <w:p>
+      <w:pPr>
+        <w:rPr>
+          <w:b/>
+          <w:bCs/>
+        </w:rPr>
+      </w:pPr>
+      <w:r>
+        <w:rPr>
+          <w:b/>
+          <w:bCs/>
+        </w:rPr>
+        <w:t>Link do Board</w:t>
+      </w:r>
+    </w:p>
+    <w:p>
+      <w:hyperlink r:id="rId13" w:history="1">
         <w:r>
           <w:rPr>
             <w:rStyle w:val="Hyperlink"/>
-            <w:b/>
-            <w:bCs/>
           </w:rPr>
-          <w:t>_</w:t>
+          <w:t>https://github.com/users/CarlosCavalheiro/projects/1</w:t>
         </w:r>
+      </w:hyperlink>
+    </w:p>
+    <w:p>
+      <w:pPr>
+        <w:rPr>
+          <w:b/>
+          <w:bCs/>
+        </w:rPr>
+      </w:pPr>
+      <w:r>
+        <w:rPr>
+          <w:b/>
+          <w:bCs/>
+        </w:rPr>
+        <w:t>Link do Repositório GitHub</w:t>
+      </w:r>
+    </w:p>
+    <w:p>
+      <w:hyperlink r:id="rId14" w:history="1">
         <w:r>
           <w:rPr>
             <w:rStyle w:val="Hyperlink"/>
-            <w:b/>
-            <w:bCs/>
           </w:rPr>
-          <w:t>yBuUZ39Jg</w:t>
+          <w:t>https://github.com/CarlosCavalheiro/GestaoInventarioPatrimonio</w:t>
         </w:r>
       </w:hyperlink>
+    </w:p>
+    <w:p>
+      <w:pPr>
+        <w:rPr>
+          <w:b/>
+          <w:bCs/>
+        </w:rPr>
+      </w:pPr>
+      <w:r>
+        <w:rPr>
+          <w:b/>
+          <w:bCs/>
+        </w:rPr>
+        <w:t>Link do Vídeo</w:t>
+      </w:r>
+    </w:p>
+    <w:p>
+      <w:pPr>
+        <w:tabs>
+          <w:tab w:val="center" w:pos="4252"/>
+        </w:tabs>
+      </w:pPr>
+      <w:hyperlink r:id="rId15" w:history="1">
+        <w:r>
+          <w:rPr>
+            <w:rStyle w:val="Hyperlink"/>
+          </w:rPr>
+          <w:t>https://youtu.be/ApaSxfnJm_M</w:t>
+        </w:r>
+      </w:hyperlink>
+    </w:p>
+    <w:p>
+      <w:pPr>
+        <w:tabs>
+          <w:tab w:val="center" w:pos="4252"/>
+        </w:tabs>
+        <w:rPr>
+          <w:b/>
+          <w:bCs/>
+        </w:rPr>
+      </w:pPr>
     </w:p>
     <w:p>
       <w:pPr>

</xml_diff>